<commit_message>
topological sorting and prims algo added
</commit_message>
<xml_diff>
--- a/src/main/resources/GRAPHS.docx
+++ b/src/main/resources/GRAPHS.docx
@@ -10305,6 +10305,9 @@
         <w:t> </w:t>
       </w:r>
       <w:r>
+        <w:rPr>
+          <w:noProof/>
+        </w:rPr>
         <w:drawing>
           <wp:inline distT="0" distB="0" distL="0" distR="0" wp14:anchorId="08CDD1B8" wp14:editId="3EA40B14">
             <wp:extent cx="3776870" cy="3046179"/>
@@ -10408,6 +10411,7 @@
         <w:rPr>
           <w:i/>
           <w:iCs/>
+          <w:noProof/>
         </w:rPr>
         <w:drawing>
           <wp:inline distT="0" distB="0" distL="0" distR="0" wp14:anchorId="5AF32229" wp14:editId="471499E6">
@@ -10579,6 +10583,7 @@
         <w:rPr>
           <w:i/>
           <w:iCs/>
+          <w:noProof/>
         </w:rPr>
         <w:drawing>
           <wp:inline distT="0" distB="0" distL="0" distR="0" wp14:anchorId="3C726014" wp14:editId="0716B541">
@@ -12147,17 +12152,11 @@
       </w:r>
       <w:proofErr w:type="gramStart"/>
       <w:r>
-        <w:t>);</w:t>
-      </w:r>
-      <w:r>
-        <w:t xml:space="preserve">   </w:t>
+        <w:t xml:space="preserve">);   </w:t>
       </w:r>
       <w:proofErr w:type="gramEnd"/>
       <w:r>
-        <w:t xml:space="preserve">  </w:t>
-      </w:r>
-      <w:r>
-        <w:t xml:space="preserve">            // Stack gives the topological order</w:t>
+        <w:t xml:space="preserve">              // Stack gives the topological order</w:t>
       </w:r>
     </w:p>
     <w:p>
@@ -12835,6 +12834,9 @@
     </w:p>
     <w:p>
       <w:r>
+        <w:rPr>
+          <w:noProof/>
+        </w:rPr>
         <w:lastRenderedPageBreak/>
         <w:drawing>
           <wp:inline distT="0" distB="0" distL="0" distR="0" wp14:anchorId="03A77BEB" wp14:editId="187F6D72">
@@ -12961,6 +12963,9 @@
     </w:p>
     <w:p>
       <w:r>
+        <w:rPr>
+          <w:noProof/>
+        </w:rPr>
         <w:drawing>
           <wp:inline distT="0" distB="0" distL="0" distR="0" wp14:anchorId="4B4994E7" wp14:editId="05F36679">
             <wp:extent cx="763270" cy="1327785"/>
@@ -13042,6 +13047,9 @@
     </w:p>
     <w:p>
       <w:r>
+        <w:rPr>
+          <w:noProof/>
+        </w:rPr>
         <w:drawing>
           <wp:inline distT="0" distB="0" distL="0" distR="0" wp14:anchorId="60E2340A" wp14:editId="69EC3E2F">
             <wp:extent cx="1431290" cy="1327785"/>
@@ -13115,6 +13123,9 @@
     </w:p>
     <w:p>
       <w:r>
+        <w:rPr>
+          <w:noProof/>
+        </w:rPr>
         <w:lastRenderedPageBreak/>
         <w:drawing>
           <wp:inline distT="0" distB="0" distL="0" distR="0" wp14:anchorId="60F34078" wp14:editId="77A72787">
@@ -13197,6 +13208,9 @@
     </w:p>
     <w:p>
       <w:r>
+        <w:rPr>
+          <w:noProof/>
+        </w:rPr>
         <w:drawing>
           <wp:inline distT="0" distB="0" distL="0" distR="0" wp14:anchorId="6EFD1774" wp14:editId="0779A483">
             <wp:extent cx="1431290" cy="1327785"/>
@@ -13273,6 +13287,9 @@
     </w:p>
     <w:p>
       <w:r>
+        <w:rPr>
+          <w:noProof/>
+        </w:rPr>
         <w:drawing>
           <wp:inline distT="0" distB="0" distL="0" distR="0" wp14:anchorId="7E79B180" wp14:editId="47F8B73E">
             <wp:extent cx="2854325" cy="1327785"/>
@@ -13964,7 +13981,47 @@
         <w:t>}</w:t>
       </w:r>
     </w:p>
-    <w:p/>
+    <w:p>
+      <w:r>
+        <w:rPr>
+          <w:b/>
+          <w:bCs/>
+        </w:rPr>
+        <w:t xml:space="preserve">Time </w:t>
+      </w:r>
+      <w:r>
+        <w:rPr>
+          <w:b/>
+          <w:bCs/>
+        </w:rPr>
+        <w:t>Complexity</w:t>
+      </w:r>
+      <w:r>
+        <w:t>:</w:t>
+      </w:r>
+      <w:r>
+        <w:t xml:space="preserve"> </w:t>
+      </w:r>
+      <w:r>
+        <w:t>O (</w:t>
+      </w:r>
+      <w:r>
+        <w:t>E log V) with the help of binary heap.</w:t>
+      </w:r>
+      <w:r>
+        <w:br/>
+      </w:r>
+      <w:r>
+        <w:rPr>
+          <w:b/>
+          <w:bCs/>
+        </w:rPr>
+        <w:t>Auxiliary Space: </w:t>
+      </w:r>
+      <w:r>
+        <w:t>O(V)</w:t>
+      </w:r>
+    </w:p>
     <w:p/>
     <w:p/>
     <w:p/>

</xml_diff>